<commit_message>
fix: correct install path to geoclaw_claude_release/; update all docs
</commit_message>
<xml_diff>
--- a/docs/GeoClaw-claude_User_Guide_v3.1.0.docx
+++ b/docs/GeoClaw-claude_User_Guide_v3.1.0.docx
@@ -403,7 +403,7 @@
                 <w:sz w:val="17"/>
                 <w:szCs w:val="17"/>
               </w:rPr>
-              <w:t xml:space="preserve">git clone https://github.com/whuyao/GeoClaw_Claude.git  →  bash install.sh  →  geoclaw-claude ask '开始分析'</w:t>
+              <w:t xml:space="preserve">git clone https://github.com/whuyao/GeoClaw_Claude.git  →  cd geoclaw_claude_release &amp;&amp; bash install.sh  →  geoclaw-claude ask '开始分析'</w:t>
             </w:r>
           </w:p>
         </w:tc>
@@ -573,7 +573,7 @@
           <w:sz w:val="18"/>
           <w:szCs w:val="18"/>
         </w:rPr>
-        <w:t xml:space="preserve">bash install.sh</w:t>
+        <w:t xml:space="preserve">cd GeoClaw_Claude/geoclaw_claude_release &amp;&amp; bash install.sh</w:t>
       </w:r>
     </w:p>
     <w:p>

</xml_diff>